<commit_message>
v2.5 — CV tense fix, brand elements, JobSeek tour page
- CV: 'Currently supporting … at Payoneer' → 'Most recently supported'
  across docx (edited via OOXML, validated), regenerated PDF, and cv.html
- Brand: AB drafting-mark logo in every nav; og-card.png social card
  (1200x630, generated reproducibly in tools/generate_art.py) wired as
  og:image on all pages with twitter summary_large_image
- jobseek.html: full system tour — pipeline schematic, two live portal
  screenshots (active-pipeline rows redacted by design), honesty-gate
  and automation highlights, stack + privacy rationale
- index: JobSeek panel links to the tour; v2.5

Co-Authored-By: Claude Fable 5 <noreply@anthropic.com>
</commit_message>
<xml_diff>
--- a/assets/Anastasia_Bogacheva_CV.docx
+++ b/assets/Anastasia_Bogacheva_CV.docx
@@ -18,21 +18,8 @@
           <w:szCs w:val="40"/>
           <w:lang w:val="en-US"/>
         </w:rPr>
-        <w:t xml:space="preserve">Anastasia </w:t>
-      </w:r>
-      <w:proofErr w:type="spellStart"/>
-      <w:r>
-        <w:rPr>
-          <w:b/>
-          <w:bCs/>
-          <w:color w:val="1F4E79"/>
-          <w:sz w:val="40"/>
-          <w:szCs w:val="40"/>
-          <w:lang w:val="en-US"/>
-        </w:rPr>
-        <w:t>Bogacheva</w:t>
-      </w:r>
-      <w:proofErr w:type="spellEnd"/>
+        <w:t>Anastasia Bogacheva</w:t>
+      </w:r>
     </w:p>
     <w:p>
       <w:pPr>
@@ -56,59 +43,7 @@
           <w:szCs w:val="21"/>
           <w:lang w:val="en-US"/>
         </w:rPr>
-        <w:t>Data Analys</w:t>
-      </w:r>
-      <w:r>
-        <w:rPr>
-          <w:b/>
-          <w:bCs/>
-          <w:sz w:val="21"/>
-          <w:szCs w:val="21"/>
-          <w:lang w:val="en-US"/>
-        </w:rPr>
-        <w:t xml:space="preserve">t </w:t>
-      </w:r>
-      <w:r>
-        <w:rPr>
-          <w:b/>
-          <w:bCs/>
-          <w:sz w:val="21"/>
-          <w:szCs w:val="21"/>
-          <w:lang w:val="en-US"/>
-        </w:rPr>
-        <w:t xml:space="preserve">/ </w:t>
-      </w:r>
-      <w:r>
-        <w:rPr>
-          <w:b/>
-          <w:bCs/>
-          <w:sz w:val="21"/>
-          <w:szCs w:val="21"/>
-          <w:lang w:val="en-US"/>
-        </w:rPr>
-        <w:t xml:space="preserve">Analytics Engineer | SQL, </w:t>
-      </w:r>
-      <w:proofErr w:type="spellStart"/>
-      <w:r>
-        <w:rPr>
-          <w:b/>
-          <w:bCs/>
-          <w:sz w:val="21"/>
-          <w:szCs w:val="21"/>
-          <w:lang w:val="en-US"/>
-        </w:rPr>
-        <w:t>BigQuery</w:t>
-      </w:r>
-      <w:proofErr w:type="spellEnd"/>
-      <w:r>
-        <w:rPr>
-          <w:b/>
-          <w:bCs/>
-          <w:sz w:val="21"/>
-          <w:szCs w:val="21"/>
-          <w:lang w:val="en-US"/>
-        </w:rPr>
-        <w:t>, Power BI, Python | Data Modeling, BI &amp; Operational Analytics</w:t>
+        <w:t>Data Analyst / Analytics Engineer | SQL, BigQuery, Power BI, Python | Data Modeling, BI &amp; Operational Analytics</w:t>
       </w:r>
     </w:p>
     <w:p>
@@ -128,45 +63,7 @@
           <w:szCs w:val="19"/>
           <w:lang w:val="en-US"/>
         </w:rPr>
-        <w:t>Israel</w:t>
-      </w:r>
-      <w:r>
-        <w:rPr>
-          <w:color w:val="595959"/>
-          <w:sz w:val="19"/>
-          <w:szCs w:val="19"/>
-          <w:lang w:val="en-US"/>
-        </w:rPr>
-        <w:t xml:space="preserve"> / </w:t>
-      </w:r>
-      <w:proofErr w:type="gramStart"/>
-      <w:r>
-        <w:rPr>
-          <w:color w:val="595959"/>
-          <w:sz w:val="19"/>
-          <w:szCs w:val="19"/>
-          <w:lang w:val="en-US"/>
-        </w:rPr>
-        <w:t>Remote</w:t>
-      </w:r>
-      <w:r>
-        <w:rPr>
-          <w:color w:val="595959"/>
-          <w:sz w:val="19"/>
-          <w:szCs w:val="19"/>
-          <w:lang w:val="en-US"/>
-        </w:rPr>
-        <w:t xml:space="preserve">  ·</w:t>
-      </w:r>
-      <w:proofErr w:type="gramEnd"/>
-      <w:r>
-        <w:rPr>
-          <w:color w:val="595959"/>
-          <w:sz w:val="19"/>
-          <w:szCs w:val="19"/>
-          <w:lang w:val="en-US"/>
-        </w:rPr>
-        <w:t xml:space="preserve">  +972 55 77 32 875  ·  kneelisad@gmail.com  ·  </w:t>
+        <w:t xml:space="preserve">Israel / Remote  ·  +972 55 77 32 875  ·  kneelisad@gmail.com  ·  </w:t>
       </w:r>
       <w:hyperlink r:id="rId5" w:history="1">
         <w:r>
@@ -177,20 +74,8 @@
             <w:u w:val="single"/>
             <w:lang w:val="en-US"/>
           </w:rPr>
-          <w:t>linkedin.com/in/</w:t>
+          <w:t>linkedin.com/in/aanastasiabogacheva</w:t>
         </w:r>
-        <w:proofErr w:type="spellStart"/>
-        <w:r>
-          <w:rPr>
-            <w:color w:val="1F4E79"/>
-            <w:sz w:val="19"/>
-            <w:szCs w:val="19"/>
-            <w:u w:val="single"/>
-            <w:lang w:val="en-US"/>
-          </w:rPr>
-          <w:t>aanastasiabogacheva</w:t>
-        </w:r>
-        <w:proofErr w:type="spellEnd"/>
       </w:hyperlink>
       <w:r>
         <w:rPr>
@@ -245,43 +130,7 @@
           <w:szCs w:val="21"/>
           <w:lang w:val="en-US"/>
         </w:rPr>
-        <w:t xml:space="preserve">Data Analyst and Analytics Engineer with 6+ years of experience turning large-scale data into operational decisions. Currently supporting Compliance, Fraud, Risk, and Payment Operations at </w:t>
-      </w:r>
-      <w:proofErr w:type="spellStart"/>
-      <w:r>
-        <w:rPr>
-          <w:sz w:val="21"/>
-          <w:szCs w:val="21"/>
-          <w:lang w:val="en-US"/>
-        </w:rPr>
-        <w:t>Payoneer</w:t>
-      </w:r>
-      <w:proofErr w:type="spellEnd"/>
-      <w:r>
-        <w:rPr>
-          <w:sz w:val="21"/>
-          <w:szCs w:val="21"/>
-          <w:lang w:val="en-US"/>
-        </w:rPr>
-        <w:t xml:space="preserve"> through </w:t>
-      </w:r>
-      <w:proofErr w:type="spellStart"/>
-      <w:r>
-        <w:rPr>
-          <w:sz w:val="21"/>
-          <w:szCs w:val="21"/>
-          <w:lang w:val="en-US"/>
-        </w:rPr>
-        <w:t>BigQuery</w:t>
-      </w:r>
-      <w:proofErr w:type="spellEnd"/>
-      <w:r>
-        <w:rPr>
-          <w:sz w:val="21"/>
-          <w:szCs w:val="21"/>
-          <w:lang w:val="en-US"/>
-        </w:rPr>
-        <w:t>, complex SQL, Python, and Power BI — designing data marts, reporting frameworks, and SLA measurement logic. Earlier experience in data engineering (ETL pipelines, data migration, Spark) means I understand the full path from source systems to insight. Known for translating complex business processes into scalable data products and finding the business-logic and data-quality issues others miss.</w:t>
+        <w:t>Data Analyst and Analytics Engineer with 6+ years of experience turning large-scale data into operational decisions. Most recently supported Compliance, Fraud, Risk, and Payment Operations at Payoneer through BigQuery, complex SQL, Python, and Power BI — designing data marts, reporting frameworks, and SLA measurement logic. Earlier experience in data engineering (ETL pipelines, data migration, Spark) means I understand the full path from source systems to insight. Known for translating complex business processes into scalable data products and finding the business-logic and data-quality issues others miss.</w:t>
       </w:r>
     </w:p>
     <w:p>
@@ -329,43 +178,7 @@
           <w:szCs w:val="21"/>
           <w:lang w:val="en-US"/>
         </w:rPr>
-        <w:t xml:space="preserve">SQL (advanced) · Google </w:t>
-      </w:r>
-      <w:proofErr w:type="spellStart"/>
-      <w:r>
-        <w:rPr>
-          <w:sz w:val="21"/>
-          <w:szCs w:val="21"/>
-          <w:lang w:val="en-US"/>
-        </w:rPr>
-        <w:t>BigQuery</w:t>
-      </w:r>
-      <w:proofErr w:type="spellEnd"/>
-      <w:r>
-        <w:rPr>
-          <w:sz w:val="21"/>
-          <w:szCs w:val="21"/>
-          <w:lang w:val="en-US"/>
-        </w:rPr>
-        <w:t xml:space="preserve"> · PostgreSQL · </w:t>
-      </w:r>
-      <w:proofErr w:type="spellStart"/>
-      <w:r>
-        <w:rPr>
-          <w:sz w:val="21"/>
-          <w:szCs w:val="21"/>
-          <w:lang w:val="en-US"/>
-        </w:rPr>
-        <w:t>ClickHouse</w:t>
-      </w:r>
-      <w:proofErr w:type="spellEnd"/>
-      <w:r>
-        <w:rPr>
-          <w:sz w:val="21"/>
-          <w:szCs w:val="21"/>
-          <w:lang w:val="en-US"/>
-        </w:rPr>
-        <w:t xml:space="preserve"> · Python · ETL/ELT · Apache Spark · Data Modeling · Data Warehousing · Power Query</w:t>
+        <w:t>SQL (advanced) · Google BigQuery · PostgreSQL · ClickHouse · Python · ETL/ELT · Apache Spark · Data Modeling · Data Warehousing · Power Query</w:t>
       </w:r>
     </w:p>
     <w:p>
@@ -484,38 +297,14 @@
           <w:bCs/>
           <w:lang w:val="en-US"/>
         </w:rPr>
-        <w:t xml:space="preserve">Compliance Data </w:t>
-      </w:r>
-      <w:proofErr w:type="gramStart"/>
-      <w:r>
-        <w:rPr>
-          <w:b/>
-          <w:bCs/>
-          <w:lang w:val="en-US"/>
-        </w:rPr>
-        <w:t>Analyst</w:t>
-      </w:r>
-      <w:r>
-        <w:rPr>
-          <w:lang w:val="en-US"/>
-        </w:rPr>
-        <w:t xml:space="preserve">  ·</w:t>
-      </w:r>
-      <w:proofErr w:type="gramEnd"/>
-      <w:r>
-        <w:rPr>
-          <w:lang w:val="en-US"/>
-        </w:rPr>
-        <w:t xml:space="preserve">  </w:t>
-      </w:r>
-      <w:proofErr w:type="spellStart"/>
-      <w:r>
-        <w:rPr>
-          <w:lang w:val="en-US"/>
-        </w:rPr>
-        <w:t>Payoneer</w:t>
-      </w:r>
-      <w:proofErr w:type="spellEnd"/>
+        <w:t>Compliance Data Analyst</w:t>
+      </w:r>
+      <w:r>
+        <w:rPr>
+          <w:lang w:val="en-US"/>
+        </w:rPr>
+        <w:t xml:space="preserve">  ·  Payoneer</w:t>
+      </w:r>
       <w:r>
         <w:rPr>
           <w:color w:val="595959"/>
@@ -543,9 +332,185 @@
           <w:szCs w:val="20"/>
           <w:lang w:val="en-US"/>
         </w:rPr>
-        <w:t xml:space="preserve">Israel · Analytics for Compliance, Risk, Fraud, and Compliance Review teams in a global </w:t>
-      </w:r>
-      <w:proofErr w:type="gramStart"/>
+        <w:t>Israel · Analytics for Compliance, Risk, Fraud, and Compliance Review teams in a global payments environment</w:t>
+      </w:r>
+    </w:p>
+    <w:p>
+      <w:pPr>
+        <w:pStyle w:val="a4"/>
+        <w:numPr>
+          <w:ilvl w:val="0"/>
+          <w:numId w:val="2"/>
+        </w:numPr>
+        <w:spacing w:after="40"/>
+        <w:rPr>
+          <w:lang w:val="en-US"/>
+        </w:rPr>
+      </w:pPr>
+      <w:r>
+        <w:rPr>
+          <w:sz w:val="21"/>
+          <w:szCs w:val="21"/>
+          <w:lang w:val="en-US"/>
+        </w:rPr>
+        <w:t>Designed and delivered enterprise Power BI dashboards used by Compliance Operations leadership to monitor SLA adherence, queue performance, case volumes, payment investigations, and operational efficiency across global teams.</w:t>
+      </w:r>
+    </w:p>
+    <w:p>
+      <w:pPr>
+        <w:pStyle w:val="a4"/>
+        <w:numPr>
+          <w:ilvl w:val="0"/>
+          <w:numId w:val="2"/>
+        </w:numPr>
+        <w:spacing w:after="40"/>
+        <w:rPr>
+          <w:lang w:val="en-US"/>
+        </w:rPr>
+      </w:pPr>
+      <w:r>
+        <w:rPr>
+          <w:sz w:val="21"/>
+          <w:szCs w:val="21"/>
+          <w:lang w:val="en-US"/>
+        </w:rPr>
+        <w:t>Designed analytical datasets and data marts in Google BigQuery, integrating CRM, payments, and compliance systems (ORN, SmartQ) to support both operational reporting and ad-hoc investigations.</w:t>
+      </w:r>
+    </w:p>
+    <w:p>
+      <w:pPr>
+        <w:pStyle w:val="a4"/>
+        <w:numPr>
+          <w:ilvl w:val="0"/>
+          <w:numId w:val="2"/>
+        </w:numPr>
+        <w:spacing w:after="40"/>
+        <w:rPr>
+          <w:lang w:val="en-US"/>
+        </w:rPr>
+      </w:pPr>
+      <w:r>
+        <w:rPr>
+          <w:sz w:val="21"/>
+          <w:szCs w:val="21"/>
+          <w:lang w:val="en-US"/>
+        </w:rPr>
+        <w:t>Developed complex SQL transformations powering operational analytics, SLA measurement, payment investigations, and risk-monitoring use cases across large-scale datasets.</w:t>
+      </w:r>
+    </w:p>
+    <w:p>
+      <w:pPr>
+        <w:pStyle w:val="a4"/>
+        <w:numPr>
+          <w:ilvl w:val="0"/>
+          <w:numId w:val="2"/>
+        </w:numPr>
+        <w:spacing w:after="40"/>
+        <w:rPr>
+          <w:lang w:val="en-US"/>
+        </w:rPr>
+      </w:pPr>
+      <w:r>
+        <w:rPr>
+          <w:sz w:val="21"/>
+          <w:szCs w:val="21"/>
+          <w:lang w:val="en-US"/>
+        </w:rPr>
+        <w:t>Rebuilt legacy SLA calculation logic — correcting interval-calculation defects, queue-transition handling, and payment-to-case linkage — measurably improving reporting accuracy and stakeholder trust.</w:t>
+      </w:r>
+    </w:p>
+    <w:p>
+      <w:pPr>
+        <w:pStyle w:val="a4"/>
+        <w:numPr>
+          <w:ilvl w:val="0"/>
+          <w:numId w:val="2"/>
+        </w:numPr>
+        <w:spacing w:after="40"/>
+        <w:rPr>
+          <w:lang w:val="en-US"/>
+        </w:rPr>
+      </w:pPr>
+      <w:r>
+        <w:rPr>
+          <w:sz w:val="21"/>
+          <w:szCs w:val="21"/>
+          <w:lang w:val="en-US"/>
+        </w:rPr>
+        <w:t>Led analytical investigations across KYC, AML, fraud, and payment-operations workflows, including root-cause analysis of SLA breaches and queue bottlenecks.</w:t>
+      </w:r>
+    </w:p>
+    <w:p>
+      <w:pPr>
+        <w:pStyle w:val="a4"/>
+        <w:numPr>
+          <w:ilvl w:val="0"/>
+          <w:numId w:val="2"/>
+        </w:numPr>
+        <w:spacing w:after="40"/>
+        <w:rPr>
+          <w:lang w:val="en-US"/>
+        </w:rPr>
+      </w:pPr>
+      <w:r>
+        <w:rPr>
+          <w:sz w:val="21"/>
+          <w:szCs w:val="21"/>
+          <w:lang w:val="en-US"/>
+        </w:rPr>
+        <w:t>Partnered with Compliance, Fraud, Product, and Data stakeholders to translate business requirements into reporting frameworks; presented findings and methodology changes to leadership.</w:t>
+      </w:r>
+    </w:p>
+    <w:p>
+      <w:pPr>
+        <w:spacing w:after="20"/>
+        <w:rPr>
+          <w:lang w:val="en-US"/>
+        </w:rPr>
+      </w:pPr>
+    </w:p>
+    <w:p>
+      <w:pPr>
+        <w:tabs>
+          <w:tab w:val="right" w:pos="9360"/>
+        </w:tabs>
+        <w:spacing w:before="160" w:after="20"/>
+        <w:rPr>
+          <w:lang w:val="en-US"/>
+        </w:rPr>
+      </w:pPr>
+      <w:r>
+        <w:rPr>
+          <w:b/>
+          <w:bCs/>
+          <w:lang w:val="en-US"/>
+        </w:rPr>
+        <w:t>Data Analyst / Data Engineer</w:t>
+      </w:r>
+      <w:r>
+        <w:rPr>
+          <w:lang w:val="en-US"/>
+        </w:rPr>
+        <w:t xml:space="preserve">  ·  VTB</w:t>
+      </w:r>
+      <w:r>
+        <w:rPr>
+          <w:color w:val="595959"/>
+          <w:sz w:val="20"/>
+          <w:szCs w:val="20"/>
+          <w:lang w:val="en-US"/>
+        </w:rPr>
+        <w:tab/>
+        <w:t>May 2020 – Aug 2024</w:t>
+      </w:r>
+    </w:p>
+    <w:p>
+      <w:pPr>
+        <w:spacing w:after="60"/>
+        <w:rPr>
+          <w:lang w:val="en-US"/>
+        </w:rPr>
+      </w:pPr>
       <w:r>
         <w:rPr>
           <w:i/>
@@ -555,9 +520,162 @@
           <w:szCs w:val="20"/>
           <w:lang w:val="en-US"/>
         </w:rPr>
-        <w:t>payments</w:t>
-      </w:r>
-      <w:proofErr w:type="gramEnd"/>
+        <w:t>Moscow, Russia · Automation, Integration &amp; Capacity Management</w:t>
+      </w:r>
+    </w:p>
+    <w:p>
+      <w:pPr>
+        <w:pStyle w:val="a4"/>
+        <w:numPr>
+          <w:ilvl w:val="0"/>
+          <w:numId w:val="2"/>
+        </w:numPr>
+        <w:spacing w:after="40"/>
+        <w:rPr>
+          <w:lang w:val="en-US"/>
+        </w:rPr>
+      </w:pPr>
+      <w:r>
+        <w:rPr>
+          <w:sz w:val="21"/>
+          <w:szCs w:val="21"/>
+          <w:lang w:val="en-US"/>
+        </w:rPr>
+        <w:t>Migrated legacy data-engineering codebase from Windows to Linux, improving system performance and scalability by ~30%.</w:t>
+      </w:r>
+    </w:p>
+    <w:p>
+      <w:pPr>
+        <w:pStyle w:val="a4"/>
+        <w:numPr>
+          <w:ilvl w:val="0"/>
+          <w:numId w:val="2"/>
+        </w:numPr>
+        <w:spacing w:after="40"/>
+        <w:rPr>
+          <w:lang w:val="en-US"/>
+        </w:rPr>
+      </w:pPr>
+      <w:r>
+        <w:rPr>
+          <w:sz w:val="21"/>
+          <w:szCs w:val="21"/>
+          <w:lang w:val="en-US"/>
+        </w:rPr>
+        <w:lastRenderedPageBreak/>
+        <w:t>Built and maintained ETL pipelines in Python and SQL, streamlining data collection, storage, and analysis across large datasets.</w:t>
+      </w:r>
+    </w:p>
+    <w:p>
+      <w:pPr>
+        <w:pStyle w:val="a4"/>
+        <w:numPr>
+          <w:ilvl w:val="0"/>
+          <w:numId w:val="2"/>
+        </w:numPr>
+        <w:spacing w:after="40"/>
+        <w:rPr>
+          <w:lang w:val="en-US"/>
+        </w:rPr>
+      </w:pPr>
+      <w:r>
+        <w:rPr>
+          <w:sz w:val="21"/>
+          <w:szCs w:val="21"/>
+          <w:lang w:val="en-US"/>
+        </w:rPr>
+        <w:t>Designed automated document workflows in Jira and Confluence, cutting project-management overhead by ~20%.</w:t>
+      </w:r>
+    </w:p>
+    <w:p>
+      <w:pPr>
+        <w:pStyle w:val="a4"/>
+        <w:numPr>
+          <w:ilvl w:val="0"/>
+          <w:numId w:val="2"/>
+        </w:numPr>
+        <w:spacing w:after="40"/>
+        <w:rPr>
+          <w:lang w:val="en-US"/>
+        </w:rPr>
+      </w:pPr>
+      <w:r>
+        <w:rPr>
+          <w:sz w:val="21"/>
+          <w:szCs w:val="21"/>
+          <w:lang w:val="en-US"/>
+        </w:rPr>
+        <w:t>Developed Power BI and Superset dashboards for capacity management, improving operational decision-making.</w:t>
+      </w:r>
+    </w:p>
+    <w:p>
+      <w:pPr>
+        <w:pStyle w:val="a4"/>
+        <w:numPr>
+          <w:ilvl w:val="0"/>
+          <w:numId w:val="2"/>
+        </w:numPr>
+        <w:spacing w:after="40"/>
+        <w:rPr>
+          <w:lang w:val="en-US"/>
+        </w:rPr>
+      </w:pPr>
+      <w:r>
+        <w:rPr>
+          <w:sz w:val="21"/>
+          <w:szCs w:val="21"/>
+          <w:lang w:val="en-US"/>
+        </w:rPr>
+        <w:t>Worked with PostgreSQL, Apache Spark, and Python for large-scale data processing.</w:t>
+      </w:r>
+    </w:p>
+    <w:p>
+      <w:pPr>
+        <w:spacing w:after="20"/>
+        <w:rPr>
+          <w:lang w:val="en-US"/>
+        </w:rPr>
+      </w:pPr>
+    </w:p>
+    <w:p>
+      <w:pPr>
+        <w:tabs>
+          <w:tab w:val="right" w:pos="9360"/>
+        </w:tabs>
+        <w:spacing w:before="160" w:after="20"/>
+        <w:rPr>
+          <w:lang w:val="en-US"/>
+        </w:rPr>
+      </w:pPr>
+      <w:r>
+        <w:rPr>
+          <w:b/>
+          <w:bCs/>
+          <w:lang w:val="en-US"/>
+        </w:rPr>
+        <w:t>Data Analyst</w:t>
+      </w:r>
+      <w:r>
+        <w:rPr>
+          <w:lang w:val="en-US"/>
+        </w:rPr>
+        <w:t xml:space="preserve">  ·  VTB</w:t>
+      </w:r>
+      <w:r>
+        <w:rPr>
+          <w:color w:val="595959"/>
+          <w:sz w:val="20"/>
+          <w:szCs w:val="20"/>
+          <w:lang w:val="en-US"/>
+        </w:rPr>
+        <w:tab/>
+        <w:t>Jan 2019 – May 2020</w:t>
+      </w:r>
+    </w:p>
+    <w:p>
+      <w:pPr>
+        <w:spacing w:after="60"/>
+      </w:pPr>
       <w:r>
         <w:rPr>
           <w:i/>
@@ -565,9 +683,8 @@
           <w:color w:val="595959"/>
           <w:sz w:val="20"/>
           <w:szCs w:val="20"/>
-          <w:lang w:val="en-US"/>
-        </w:rPr>
-        <w:t xml:space="preserve"> environment</w:t>
+        </w:rPr>
+        <w:t>Moscow, Russia</w:t>
       </w:r>
     </w:p>
     <w:p>
@@ -588,7 +705,7 @@
           <w:szCs w:val="21"/>
           <w:lang w:val="en-US"/>
         </w:rPr>
-        <w:t>Designed and delivered enterprise Power BI dashboards used by Compliance Operations leadership to monitor SLA adherence, queue performance, case volumes, payment investigations, and operational efficiency across global teams.</w:t>
+        <w:t>Built complex calculations and dynamic dashboards in Excel using advanced formulas and VBA, automating recurring reporting processes.</w:t>
       </w:r>
     </w:p>
     <w:p>
@@ -609,43 +726,65 @@
           <w:szCs w:val="21"/>
           <w:lang w:val="en-US"/>
         </w:rPr>
-        <w:t xml:space="preserve">Designed analytical datasets and data marts in Google </w:t>
-      </w:r>
-      <w:proofErr w:type="spellStart"/>
-      <w:r>
-        <w:rPr>
-          <w:sz w:val="21"/>
-          <w:szCs w:val="21"/>
-          <w:lang w:val="en-US"/>
-        </w:rPr>
-        <w:t>BigQuery</w:t>
-      </w:r>
-      <w:proofErr w:type="spellEnd"/>
-      <w:r>
-        <w:rPr>
-          <w:sz w:val="21"/>
-          <w:szCs w:val="21"/>
-          <w:lang w:val="en-US"/>
-        </w:rPr>
-        <w:t xml:space="preserve">, integrating CRM, payments, and compliance systems (ORN, </w:t>
-      </w:r>
-      <w:proofErr w:type="spellStart"/>
-      <w:r>
-        <w:rPr>
-          <w:sz w:val="21"/>
-          <w:szCs w:val="21"/>
-          <w:lang w:val="en-US"/>
-        </w:rPr>
-        <w:t>SmartQ</w:t>
-      </w:r>
-      <w:proofErr w:type="spellEnd"/>
-      <w:r>
-        <w:rPr>
-          <w:sz w:val="21"/>
-          <w:szCs w:val="21"/>
-          <w:lang w:val="en-US"/>
-        </w:rPr>
-        <w:t>) to support both operational reporting and ad-hoc investigations.</w:t>
+        <w:t>Created clear visualizations and presentations that translated analysis into decisions for technical and non-technical stakeholders.</w:t>
+      </w:r>
+    </w:p>
+    <w:p>
+      <w:pPr>
+        <w:spacing w:after="20"/>
+        <w:rPr>
+          <w:lang w:val="en-US"/>
+        </w:rPr>
+      </w:pPr>
+    </w:p>
+    <w:p>
+      <w:pPr>
+        <w:tabs>
+          <w:tab w:val="right" w:pos="9360"/>
+        </w:tabs>
+        <w:spacing w:before="160" w:after="20"/>
+        <w:rPr>
+          <w:lang w:val="en-US"/>
+        </w:rPr>
+      </w:pPr>
+      <w:r>
+        <w:rPr>
+          <w:b/>
+          <w:bCs/>
+          <w:lang w:val="en-US"/>
+        </w:rPr>
+        <w:t>Data Entry Specialist / Marketing Manager</w:t>
+      </w:r>
+      <w:r>
+        <w:rPr>
+          <w:lang w:val="en-US"/>
+        </w:rPr>
+        <w:t xml:space="preserve">  ·  Moscow Industrial Bank</w:t>
+      </w:r>
+      <w:r>
+        <w:rPr>
+          <w:color w:val="595959"/>
+          <w:sz w:val="20"/>
+          <w:szCs w:val="20"/>
+          <w:lang w:val="en-US"/>
+        </w:rPr>
+        <w:tab/>
+        <w:t>Apr 2015 – Dec 2018</w:t>
+      </w:r>
+    </w:p>
+    <w:p>
+      <w:pPr>
+        <w:spacing w:after="60"/>
+      </w:pPr>
+      <w:r>
+        <w:rPr>
+          <w:i/>
+          <w:iCs/>
+          <w:color w:val="595959"/>
+          <w:sz w:val="20"/>
+          <w:szCs w:val="20"/>
+        </w:rPr>
+        <w:t>Moscow, Russia</w:t>
       </w:r>
     </w:p>
     <w:p>
@@ -666,7 +805,7 @@
           <w:szCs w:val="21"/>
           <w:lang w:val="en-US"/>
         </w:rPr>
-        <w:t>Developed complex SQL transformations powering operational analytics, SLA measurement, payment investigations, and risk-monitoring use cases across large-scale datasets.</w:t>
+        <w:t>Collected, analyzed, and automated branch-efficiency reports for legal-entity clients using Excel, Power Query, and VBA.</w:t>
       </w:r>
     </w:p>
     <w:p>
@@ -687,7 +826,56 @@
           <w:szCs w:val="21"/>
           <w:lang w:val="en-US"/>
         </w:rPr>
-        <w:t>Rebuilt legacy SLA calculation logic — correcting interval-calculation defects, queue-transition handling, and payment-to-case linkage — measurably improving reporting accuracy and stakeholder trust.</w:t>
+        <w:t>Prepared presentations and promotional materials for senior management and external stakeholders.</w:t>
+      </w:r>
+    </w:p>
+    <w:p>
+      <w:pPr>
+        <w:pBdr>
+          <w:bottom w:val="single" w:sz="6" w:space="2" w:color="1F4E79"/>
+        </w:pBdr>
+        <w:spacing w:before="240" w:after="80"/>
+        <w:rPr>
+          <w:lang w:val="en-US"/>
+        </w:rPr>
+      </w:pPr>
+      <w:r>
+        <w:rPr>
+          <w:b/>
+          <w:bCs/>
+          <w:color w:val="1F4E79"/>
+          <w:sz w:val="24"/>
+          <w:szCs w:val="24"/>
+          <w:lang w:val="en-US"/>
+        </w:rPr>
+        <w:t>SELECTED PROJECTS</w:t>
+      </w:r>
+    </w:p>
+    <w:p>
+      <w:pPr>
+        <w:spacing w:before="120" w:after="20"/>
+        <w:rPr>
+          <w:lang w:val="en-US"/>
+        </w:rPr>
+      </w:pPr>
+      <w:r>
+        <w:rPr>
+          <w:b/>
+          <w:bCs/>
+          <w:sz w:val="21"/>
+          <w:szCs w:val="21"/>
+          <w:lang w:val="en-US"/>
+        </w:rPr>
+        <w:t>Compliance SLA Analytics &amp; Measurement</w:t>
+      </w:r>
+      <w:r>
+        <w:rPr>
+          <w:color w:val="595959"/>
+          <w:sz w:val="21"/>
+          <w:szCs w:val="21"/>
+          <w:lang w:val="en-US"/>
+        </w:rPr>
+        <w:t xml:space="preserve">  ·  Payoneer</w:t>
       </w:r>
     </w:p>
     <w:p>
@@ -708,7 +896,7 @@
           <w:szCs w:val="21"/>
           <w:lang w:val="en-US"/>
         </w:rPr>
-        <w:t>Led analytical investigations across KYC, AML, fraud, and payment-operations workflows, including root-cause analysis of SLA breaches and queue bottlenecks.</w:t>
+        <w:t>Rebuilt SLA measurement logic for Compliance Operations, correcting interval-calculation defects and queue-transition handling that had been skewing reporting.</w:t>
       </w:r>
     </w:p>
     <w:p>
@@ -729,7 +917,7 @@
           <w:szCs w:val="21"/>
           <w:lang w:val="en-US"/>
         </w:rPr>
-        <w:t>Partnered with Compliance, Fraud, Product, and Data stakeholders to translate business requirements into reporting frameworks; presented findings and methodology changes to leadership.</w:t>
+        <w:t>Delivered the Power BI reporting layer leadership uses to track SLA adherence and queue performance, improving operational visibility and decision-making.</w:t>
       </w:r>
     </w:p>
     <w:p>
@@ -742,72 +930,24 @@
     </w:p>
     <w:p>
       <w:pPr>
-        <w:tabs>
-          <w:tab w:val="right" w:pos="9360"/>
-        </w:tabs>
-        <w:spacing w:before="160" w:after="20"/>
-        <w:rPr>
-          <w:lang w:val="en-US"/>
-        </w:rPr>
+        <w:spacing w:before="80" w:after="20"/>
       </w:pPr>
       <w:r>
         <w:rPr>
           <w:b/>
           <w:bCs/>
-          <w:lang w:val="en-US"/>
-        </w:rPr>
-        <w:t xml:space="preserve">Data Analyst / Data </w:t>
-      </w:r>
-      <w:proofErr w:type="gramStart"/>
-      <w:r>
-        <w:rPr>
-          <w:b/>
-          <w:bCs/>
-          <w:lang w:val="en-US"/>
-        </w:rPr>
-        <w:t>Engineer</w:t>
-      </w:r>
-      <w:r>
-        <w:rPr>
-          <w:lang w:val="en-US"/>
-        </w:rPr>
-        <w:t xml:space="preserve">  ·</w:t>
-      </w:r>
-      <w:proofErr w:type="gramEnd"/>
-      <w:r>
-        <w:rPr>
-          <w:lang w:val="en-US"/>
-        </w:rPr>
-        <w:t xml:space="preserve">  VTB</w:t>
+          <w:sz w:val="21"/>
+          <w:szCs w:val="21"/>
+        </w:rPr>
+        <w:t>Payment Investigation Analytics</w:t>
       </w:r>
       <w:r>
         <w:rPr>
           <w:color w:val="595959"/>
-          <w:sz w:val="20"/>
-          <w:szCs w:val="20"/>
-          <w:lang w:val="en-US"/>
-        </w:rPr>
-        <w:tab/>
-        <w:t>May 2020 – Aug 2024</w:t>
-      </w:r>
-    </w:p>
-    <w:p>
-      <w:pPr>
-        <w:spacing w:after="60"/>
-        <w:rPr>
-          <w:lang w:val="en-US"/>
-        </w:rPr>
-      </w:pPr>
-      <w:r>
-        <w:rPr>
-          <w:i/>
-          <w:iCs/>
-          <w:color w:val="595959"/>
-          <w:sz w:val="20"/>
-          <w:szCs w:val="20"/>
-          <w:lang w:val="en-US"/>
-        </w:rPr>
-        <w:t>Moscow, Russia · Automation, Integration &amp; Capacity Management</w:t>
+          <w:sz w:val="21"/>
+          <w:szCs w:val="21"/>
+        </w:rPr>
+        <w:t xml:space="preserve">  ·  Payoneer</w:t>
       </w:r>
     </w:p>
     <w:p>
@@ -828,7 +968,7 @@
           <w:szCs w:val="21"/>
           <w:lang w:val="en-US"/>
         </w:rPr>
-        <w:t>Migrated legacy data-engineering codebase from Windows to Linux, improving system performance and scalability by ~30%.</w:t>
+        <w:t>Developed payment-to-case linkage logic across compliance and payment systems in BigQuery, enabling accurate reconciliation between source systems and operational dashboards.</w:t>
       </w:r>
     </w:p>
     <w:p>
@@ -849,303 +989,7 @@
           <w:szCs w:val="21"/>
           <w:lang w:val="en-US"/>
         </w:rPr>
-        <w:lastRenderedPageBreak/>
-        <w:t>Built and maintained ETL pipelines in Python and SQL, streamlining data collection, storage, and analysis across large datasets.</w:t>
-      </w:r>
-    </w:p>
-    <w:p>
-      <w:pPr>
-        <w:pStyle w:val="a4"/>
-        <w:numPr>
-          <w:ilvl w:val="0"/>
-          <w:numId w:val="2"/>
-        </w:numPr>
-        <w:spacing w:after="40"/>
-        <w:rPr>
-          <w:lang w:val="en-US"/>
-        </w:rPr>
-      </w:pPr>
-      <w:r>
-        <w:rPr>
-          <w:sz w:val="21"/>
-          <w:szCs w:val="21"/>
-          <w:lang w:val="en-US"/>
-        </w:rPr>
-        <w:t>Designed automated document workflows in Jira and Confluence, cutting project-management overhead by ~20%.</w:t>
-      </w:r>
-    </w:p>
-    <w:p>
-      <w:pPr>
-        <w:pStyle w:val="a4"/>
-        <w:numPr>
-          <w:ilvl w:val="0"/>
-          <w:numId w:val="2"/>
-        </w:numPr>
-        <w:spacing w:after="40"/>
-        <w:rPr>
-          <w:lang w:val="en-US"/>
-        </w:rPr>
-      </w:pPr>
-      <w:r>
-        <w:rPr>
-          <w:sz w:val="21"/>
-          <w:szCs w:val="21"/>
-          <w:lang w:val="en-US"/>
-        </w:rPr>
-        <w:t>Developed Power BI and Superset dashboards for capacity management, improving operational decision-making.</w:t>
-      </w:r>
-    </w:p>
-    <w:p>
-      <w:pPr>
-        <w:pStyle w:val="a4"/>
-        <w:numPr>
-          <w:ilvl w:val="0"/>
-          <w:numId w:val="2"/>
-        </w:numPr>
-        <w:spacing w:after="40"/>
-        <w:rPr>
-          <w:lang w:val="en-US"/>
-        </w:rPr>
-      </w:pPr>
-      <w:r>
-        <w:rPr>
-          <w:sz w:val="21"/>
-          <w:szCs w:val="21"/>
-          <w:lang w:val="en-US"/>
-        </w:rPr>
-        <w:t>Worked with PostgreSQL, Apache Spark, and Python for large-scale data processing.</w:t>
-      </w:r>
-    </w:p>
-    <w:p>
-      <w:pPr>
-        <w:spacing w:after="20"/>
-        <w:rPr>
-          <w:lang w:val="en-US"/>
-        </w:rPr>
-      </w:pPr>
-    </w:p>
-    <w:p>
-      <w:pPr>
-        <w:tabs>
-          <w:tab w:val="right" w:pos="9360"/>
-        </w:tabs>
-        <w:spacing w:before="160" w:after="20"/>
-        <w:rPr>
-          <w:lang w:val="en-US"/>
-        </w:rPr>
-      </w:pPr>
-      <w:r>
-        <w:rPr>
-          <w:b/>
-          <w:bCs/>
-          <w:lang w:val="en-US"/>
-        </w:rPr>
-        <w:t xml:space="preserve">Data </w:t>
-      </w:r>
-      <w:proofErr w:type="gramStart"/>
-      <w:r>
-        <w:rPr>
-          <w:b/>
-          <w:bCs/>
-          <w:lang w:val="en-US"/>
-        </w:rPr>
-        <w:t>Analyst</w:t>
-      </w:r>
-      <w:r>
-        <w:rPr>
-          <w:lang w:val="en-US"/>
-        </w:rPr>
-        <w:t xml:space="preserve">  ·</w:t>
-      </w:r>
-      <w:proofErr w:type="gramEnd"/>
-      <w:r>
-        <w:rPr>
-          <w:lang w:val="en-US"/>
-        </w:rPr>
-        <w:t xml:space="preserve">  VTB</w:t>
-      </w:r>
-      <w:r>
-        <w:rPr>
-          <w:color w:val="595959"/>
-          <w:sz w:val="20"/>
-          <w:szCs w:val="20"/>
-          <w:lang w:val="en-US"/>
-        </w:rPr>
-        <w:tab/>
-        <w:t>Jan 2019 – May 2020</w:t>
-      </w:r>
-    </w:p>
-    <w:p>
-      <w:pPr>
-        <w:spacing w:after="60"/>
-      </w:pPr>
-      <w:r>
-        <w:rPr>
-          <w:i/>
-          <w:iCs/>
-          <w:color w:val="595959"/>
-          <w:sz w:val="20"/>
-          <w:szCs w:val="20"/>
-        </w:rPr>
-        <w:t>Moscow, Russia</w:t>
-      </w:r>
-    </w:p>
-    <w:p>
-      <w:pPr>
-        <w:pStyle w:val="a4"/>
-        <w:numPr>
-          <w:ilvl w:val="0"/>
-          <w:numId w:val="2"/>
-        </w:numPr>
-        <w:spacing w:after="40"/>
-        <w:rPr>
-          <w:lang w:val="en-US"/>
-        </w:rPr>
-      </w:pPr>
-      <w:r>
-        <w:rPr>
-          <w:sz w:val="21"/>
-          <w:szCs w:val="21"/>
-          <w:lang w:val="en-US"/>
-        </w:rPr>
-        <w:t>Built complex calculations and dynamic dashboards in Excel using advanced formulas and VBA, automating recurring reporting processes.</w:t>
-      </w:r>
-    </w:p>
-    <w:p>
-      <w:pPr>
-        <w:pStyle w:val="a4"/>
-        <w:numPr>
-          <w:ilvl w:val="0"/>
-          <w:numId w:val="2"/>
-        </w:numPr>
-        <w:spacing w:after="40"/>
-        <w:rPr>
-          <w:lang w:val="en-US"/>
-        </w:rPr>
-      </w:pPr>
-      <w:r>
-        <w:rPr>
-          <w:sz w:val="21"/>
-          <w:szCs w:val="21"/>
-          <w:lang w:val="en-US"/>
-        </w:rPr>
-        <w:t>Created clear visualizations and presentations that translated analysis into decisions for technical and non-technical stakeholders.</w:t>
-      </w:r>
-    </w:p>
-    <w:p>
-      <w:pPr>
-        <w:spacing w:after="20"/>
-        <w:rPr>
-          <w:lang w:val="en-US"/>
-        </w:rPr>
-      </w:pPr>
-    </w:p>
-    <w:p>
-      <w:pPr>
-        <w:tabs>
-          <w:tab w:val="right" w:pos="9360"/>
-        </w:tabs>
-        <w:spacing w:before="160" w:after="20"/>
-        <w:rPr>
-          <w:lang w:val="en-US"/>
-        </w:rPr>
-      </w:pPr>
-      <w:r>
-        <w:rPr>
-          <w:b/>
-          <w:bCs/>
-          <w:lang w:val="en-US"/>
-        </w:rPr>
-        <w:t xml:space="preserve">Data Entry Specialist / Marketing </w:t>
-      </w:r>
-      <w:proofErr w:type="gramStart"/>
-      <w:r>
-        <w:rPr>
-          <w:b/>
-          <w:bCs/>
-          <w:lang w:val="en-US"/>
-        </w:rPr>
-        <w:t>Manager</w:t>
-      </w:r>
-      <w:r>
-        <w:rPr>
-          <w:lang w:val="en-US"/>
-        </w:rPr>
-        <w:t xml:space="preserve">  ·</w:t>
-      </w:r>
-      <w:proofErr w:type="gramEnd"/>
-      <w:r>
-        <w:rPr>
-          <w:lang w:val="en-US"/>
-        </w:rPr>
-        <w:t xml:space="preserve">  Moscow Industrial Bank</w:t>
-      </w:r>
-      <w:r>
-        <w:rPr>
-          <w:color w:val="595959"/>
-          <w:sz w:val="20"/>
-          <w:szCs w:val="20"/>
-          <w:lang w:val="en-US"/>
-        </w:rPr>
-        <w:tab/>
-        <w:t>Apr 2015 – Dec 2018</w:t>
-      </w:r>
-    </w:p>
-    <w:p>
-      <w:pPr>
-        <w:spacing w:after="60"/>
-      </w:pPr>
-      <w:r>
-        <w:rPr>
-          <w:i/>
-          <w:iCs/>
-          <w:color w:val="595959"/>
-          <w:sz w:val="20"/>
-          <w:szCs w:val="20"/>
-        </w:rPr>
-        <w:t>Moscow, Russia</w:t>
-      </w:r>
-    </w:p>
-    <w:p>
-      <w:pPr>
-        <w:pStyle w:val="a4"/>
-        <w:numPr>
-          <w:ilvl w:val="0"/>
-          <w:numId w:val="2"/>
-        </w:numPr>
-        <w:spacing w:after="40"/>
-        <w:rPr>
-          <w:lang w:val="en-US"/>
-        </w:rPr>
-      </w:pPr>
-      <w:r>
-        <w:rPr>
-          <w:sz w:val="21"/>
-          <w:szCs w:val="21"/>
-          <w:lang w:val="en-US"/>
-        </w:rPr>
-        <w:t>Collected, analyzed, and automated branch-efficiency reports for legal-entity clients using Excel, Power Query, and VBA.</w:t>
-      </w:r>
-    </w:p>
-    <w:p>
-      <w:pPr>
-        <w:pStyle w:val="a4"/>
-        <w:numPr>
-          <w:ilvl w:val="0"/>
-          <w:numId w:val="2"/>
-        </w:numPr>
-        <w:spacing w:after="40"/>
-        <w:rPr>
-          <w:lang w:val="en-US"/>
-        </w:rPr>
-      </w:pPr>
-      <w:r>
-        <w:rPr>
-          <w:sz w:val="21"/>
-          <w:szCs w:val="21"/>
-          <w:lang w:val="en-US"/>
-        </w:rPr>
-        <w:t>Prepared presentations and promotional materials for senior management and external stakeholders.</w:t>
+        <w:t>Supported fraud and compliance investigations through reusable analytical datasets, reducing manual effort for recurring investigation workflows.</w:t>
       </w:r>
     </w:p>
     <w:p>
@@ -1167,12 +1011,12 @@
           <w:szCs w:val="24"/>
           <w:lang w:val="en-US"/>
         </w:rPr>
-        <w:t>SELECTED PROJECTS</w:t>
-      </w:r>
-    </w:p>
-    <w:p>
-      <w:pPr>
-        <w:spacing w:before="120" w:after="20"/>
+        <w:t>EDUCATION</w:t>
+      </w:r>
+    </w:p>
+    <w:p>
+      <w:pPr>
+        <w:spacing w:after="40"/>
         <w:rPr>
           <w:lang w:val="en-US"/>
         </w:rPr>
@@ -1185,18 +1029,7 @@
           <w:szCs w:val="21"/>
           <w:lang w:val="en-US"/>
         </w:rPr>
-        <w:t xml:space="preserve">Compliance SLA Analytics &amp; </w:t>
-      </w:r>
-      <w:proofErr w:type="gramStart"/>
-      <w:r>
-        <w:rPr>
-          <w:b/>
-          <w:bCs/>
-          <w:sz w:val="21"/>
-          <w:szCs w:val="21"/>
-          <w:lang w:val="en-US"/>
-        </w:rPr>
-        <w:t>Measurement</w:t>
+        <w:t>Master’s Degree, Marketing</w:t>
       </w:r>
       <w:r>
         <w:rPr>
@@ -1205,290 +1038,7 @@
           <w:szCs w:val="21"/>
           <w:lang w:val="en-US"/>
         </w:rPr>
-        <w:t xml:space="preserve">  ·</w:t>
-      </w:r>
-      <w:proofErr w:type="gramEnd"/>
-      <w:r>
-        <w:rPr>
-          <w:color w:val="595959"/>
-          <w:sz w:val="21"/>
-          <w:szCs w:val="21"/>
-          <w:lang w:val="en-US"/>
-        </w:rPr>
-        <w:t xml:space="preserve">  </w:t>
-      </w:r>
-      <w:proofErr w:type="spellStart"/>
-      <w:r>
-        <w:rPr>
-          <w:color w:val="595959"/>
-          <w:sz w:val="21"/>
-          <w:szCs w:val="21"/>
-          <w:lang w:val="en-US"/>
-        </w:rPr>
-        <w:t>Payoneer</w:t>
-      </w:r>
-      <w:proofErr w:type="spellEnd"/>
-    </w:p>
-    <w:p>
-      <w:pPr>
-        <w:pStyle w:val="a4"/>
-        <w:numPr>
-          <w:ilvl w:val="0"/>
-          <w:numId w:val="2"/>
-        </w:numPr>
-        <w:spacing w:after="40"/>
-        <w:rPr>
-          <w:lang w:val="en-US"/>
-        </w:rPr>
-      </w:pPr>
-      <w:r>
-        <w:rPr>
-          <w:sz w:val="21"/>
-          <w:szCs w:val="21"/>
-          <w:lang w:val="en-US"/>
-        </w:rPr>
-        <w:t>Rebuilt SLA measurement logic for Compliance Operations, correcting interval-calculation defects and queue-transition handling that had been skewing reporting.</w:t>
-      </w:r>
-    </w:p>
-    <w:p>
-      <w:pPr>
-        <w:pStyle w:val="a4"/>
-        <w:numPr>
-          <w:ilvl w:val="0"/>
-          <w:numId w:val="2"/>
-        </w:numPr>
-        <w:spacing w:after="40"/>
-        <w:rPr>
-          <w:lang w:val="en-US"/>
-        </w:rPr>
-      </w:pPr>
-      <w:r>
-        <w:rPr>
-          <w:sz w:val="21"/>
-          <w:szCs w:val="21"/>
-          <w:lang w:val="en-US"/>
-        </w:rPr>
-        <w:t>Delivered the Power BI reporting layer leadership uses to track SLA adherence and queue performance, improving operational visibility and decision-making.</w:t>
-      </w:r>
-    </w:p>
-    <w:p>
-      <w:pPr>
-        <w:spacing w:after="20"/>
-        <w:rPr>
-          <w:lang w:val="en-US"/>
-        </w:rPr>
-      </w:pPr>
-    </w:p>
-    <w:p>
-      <w:pPr>
-        <w:spacing w:before="80" w:after="20"/>
-      </w:pPr>
-      <w:proofErr w:type="spellStart"/>
-      <w:r>
-        <w:rPr>
-          <w:b/>
-          <w:bCs/>
-          <w:sz w:val="21"/>
-          <w:szCs w:val="21"/>
-        </w:rPr>
-        <w:t>Payment</w:t>
-      </w:r>
-      <w:proofErr w:type="spellEnd"/>
-      <w:r>
-        <w:rPr>
-          <w:b/>
-          <w:bCs/>
-          <w:sz w:val="21"/>
-          <w:szCs w:val="21"/>
-        </w:rPr>
-        <w:t xml:space="preserve"> </w:t>
-      </w:r>
-      <w:proofErr w:type="spellStart"/>
-      <w:r>
-        <w:rPr>
-          <w:b/>
-          <w:bCs/>
-          <w:sz w:val="21"/>
-          <w:szCs w:val="21"/>
-        </w:rPr>
-        <w:t>Investigation</w:t>
-      </w:r>
-      <w:proofErr w:type="spellEnd"/>
-      <w:r>
-        <w:rPr>
-          <w:b/>
-          <w:bCs/>
-          <w:sz w:val="21"/>
-          <w:szCs w:val="21"/>
-        </w:rPr>
-        <w:t xml:space="preserve"> </w:t>
-      </w:r>
-      <w:proofErr w:type="gramStart"/>
-      <w:r>
-        <w:rPr>
-          <w:b/>
-          <w:bCs/>
-          <w:sz w:val="21"/>
-          <w:szCs w:val="21"/>
-        </w:rPr>
-        <w:t>Analytics</w:t>
-      </w:r>
-      <w:r>
-        <w:rPr>
-          <w:color w:val="595959"/>
-          <w:sz w:val="21"/>
-          <w:szCs w:val="21"/>
-        </w:rPr>
-        <w:t xml:space="preserve">  ·</w:t>
-      </w:r>
-      <w:proofErr w:type="gramEnd"/>
-      <w:r>
-        <w:rPr>
-          <w:color w:val="595959"/>
-          <w:sz w:val="21"/>
-          <w:szCs w:val="21"/>
-        </w:rPr>
-        <w:t xml:space="preserve">  </w:t>
-      </w:r>
-      <w:proofErr w:type="spellStart"/>
-      <w:r>
-        <w:rPr>
-          <w:color w:val="595959"/>
-          <w:sz w:val="21"/>
-          <w:szCs w:val="21"/>
-        </w:rPr>
-        <w:t>Payoneer</w:t>
-      </w:r>
-      <w:proofErr w:type="spellEnd"/>
-    </w:p>
-    <w:p>
-      <w:pPr>
-        <w:pStyle w:val="a4"/>
-        <w:numPr>
-          <w:ilvl w:val="0"/>
-          <w:numId w:val="2"/>
-        </w:numPr>
-        <w:spacing w:after="40"/>
-        <w:rPr>
-          <w:lang w:val="en-US"/>
-        </w:rPr>
-      </w:pPr>
-      <w:r>
-        <w:rPr>
-          <w:sz w:val="21"/>
-          <w:szCs w:val="21"/>
-          <w:lang w:val="en-US"/>
-        </w:rPr>
-        <w:t xml:space="preserve">Developed payment-to-case linkage logic across compliance and payment systems in </w:t>
-      </w:r>
-      <w:proofErr w:type="spellStart"/>
-      <w:r>
-        <w:rPr>
-          <w:sz w:val="21"/>
-          <w:szCs w:val="21"/>
-          <w:lang w:val="en-US"/>
-        </w:rPr>
-        <w:t>BigQuery</w:t>
-      </w:r>
-      <w:proofErr w:type="spellEnd"/>
-      <w:r>
-        <w:rPr>
-          <w:sz w:val="21"/>
-          <w:szCs w:val="21"/>
-          <w:lang w:val="en-US"/>
-        </w:rPr>
-        <w:t>, enabling accurate reconciliation between source systems and operational dashboards.</w:t>
-      </w:r>
-    </w:p>
-    <w:p>
-      <w:pPr>
-        <w:pStyle w:val="a4"/>
-        <w:numPr>
-          <w:ilvl w:val="0"/>
-          <w:numId w:val="2"/>
-        </w:numPr>
-        <w:spacing w:after="40"/>
-        <w:rPr>
-          <w:lang w:val="en-US"/>
-        </w:rPr>
-      </w:pPr>
-      <w:r>
-        <w:rPr>
-          <w:sz w:val="21"/>
-          <w:szCs w:val="21"/>
-          <w:lang w:val="en-US"/>
-        </w:rPr>
-        <w:t>Supported fraud and compliance investigations through reusable analytical datasets, reducing manual effort for recurring investigation workflows.</w:t>
-      </w:r>
-    </w:p>
-    <w:p>
-      <w:pPr>
-        <w:pBdr>
-          <w:bottom w:val="single" w:sz="6" w:space="2" w:color="1F4E79"/>
-        </w:pBdr>
-        <w:spacing w:before="240" w:after="80"/>
-        <w:rPr>
-          <w:lang w:val="en-US"/>
-        </w:rPr>
-      </w:pPr>
-      <w:r>
-        <w:rPr>
-          <w:b/>
-          <w:bCs/>
-          <w:color w:val="1F4E79"/>
-          <w:sz w:val="24"/>
-          <w:szCs w:val="24"/>
-          <w:lang w:val="en-US"/>
-        </w:rPr>
-        <w:t>EDUCATION</w:t>
-      </w:r>
-    </w:p>
-    <w:p>
-      <w:pPr>
-        <w:spacing w:after="40"/>
-        <w:rPr>
-          <w:lang w:val="en-US"/>
-        </w:rPr>
-      </w:pPr>
-      <w:r>
-        <w:rPr>
-          <w:b/>
-          <w:bCs/>
-          <w:sz w:val="21"/>
-          <w:szCs w:val="21"/>
-          <w:lang w:val="en-US"/>
-        </w:rPr>
-        <w:t xml:space="preserve">Master’s Degree, </w:t>
-      </w:r>
-      <w:proofErr w:type="gramStart"/>
-      <w:r>
-        <w:rPr>
-          <w:b/>
-          <w:bCs/>
-          <w:sz w:val="21"/>
-          <w:szCs w:val="21"/>
-          <w:lang w:val="en-US"/>
-        </w:rPr>
-        <w:t>Marketing</w:t>
-      </w:r>
-      <w:r>
-        <w:rPr>
-          <w:color w:val="595959"/>
-          <w:sz w:val="21"/>
-          <w:szCs w:val="21"/>
-          <w:lang w:val="en-US"/>
-        </w:rPr>
-        <w:t xml:space="preserve">  ·</w:t>
-      </w:r>
-      <w:proofErr w:type="gramEnd"/>
-      <w:r>
-        <w:rPr>
-          <w:color w:val="595959"/>
-          <w:sz w:val="21"/>
-          <w:szCs w:val="21"/>
-          <w:lang w:val="en-US"/>
-        </w:rPr>
-        <w:t xml:space="preserve">  Plekhanov Russian University of Economics  ·  2009 – 2014</w:t>
+        <w:t xml:space="preserve">  ·  Plekhanov Russian University of Economics  ·  2009 – 2014</w:t>
       </w:r>
     </w:p>
     <w:p>

</xml_diff>